<commit_message>
added core objective intro and resized images
</commit_message>
<xml_diff>
--- a/AD_Project.docx
+++ b/AD_Project.docx
@@ -459,20 +459,144 @@
     <w:p>
       <w:pPr>
         <w:spacing w:line="240" w:lineRule="auto"/>
-        <w:ind w:left="360"/>
-        <w:rPr>
-          <w:rFonts w:ascii="Times New Roman" w:hAnsi="Times New Roman" w:cs="Times New Roman"/>
-          <w:sz w:val="22"/>
-          <w:szCs w:val="22"/>
-        </w:rPr>
-      </w:pPr>
-      <w:r>
-        <w:rPr>
-          <w:rFonts w:ascii="Times New Roman" w:hAnsi="Times New Roman" w:cs="Times New Roman"/>
-          <w:sz w:val="22"/>
-          <w:szCs w:val="22"/>
-        </w:rPr>
-        <w:t xml:space="preserve">Downloaded VirtualBox off the website </w:t>
+        <w:rPr>
+          <w:rFonts w:ascii="Times New Roman" w:hAnsi="Times New Roman" w:cs="Times New Roman"/>
+          <w:sz w:val="22"/>
+          <w:szCs w:val="22"/>
+        </w:rPr>
+      </w:pPr>
+      <w:r>
+        <w:rPr>
+          <w:rFonts w:ascii="Times New Roman" w:hAnsi="Times New Roman" w:cs="Times New Roman"/>
+          <w:sz w:val="22"/>
+          <w:szCs w:val="22"/>
+        </w:rPr>
+        <w:t>Core Objective</w:t>
+      </w:r>
+    </w:p>
+    <w:p>
+      <w:pPr>
+        <w:spacing w:line="240" w:lineRule="auto"/>
+        <w:rPr>
+          <w:rFonts w:ascii="Times New Roman" w:hAnsi="Times New Roman" w:cs="Times New Roman"/>
+          <w:sz w:val="22"/>
+          <w:szCs w:val="22"/>
+        </w:rPr>
+      </w:pPr>
+      <w:r>
+        <w:rPr>
+          <w:rFonts w:ascii="Times New Roman" w:hAnsi="Times New Roman" w:cs="Times New Roman"/>
+          <w:sz w:val="22"/>
+          <w:szCs w:val="22"/>
+        </w:rPr>
+        <w:tab/>
+      </w:r>
+      <w:r>
+        <w:rPr>
+          <w:rFonts w:ascii="Times New Roman" w:hAnsi="Times New Roman" w:cs="Times New Roman"/>
+          <w:sz w:val="22"/>
+          <w:szCs w:val="22"/>
+        </w:rPr>
+        <w:t xml:space="preserve">The goal of this project is to walk through setting up a virtualized home lab environment using VirtualBox with Windows Server 2022 and Windows 11 VMs, configure VirtualBox to allow for different VMs, </w:t>
+      </w:r>
+      <w:r>
+        <w:rPr>
+          <w:rFonts w:ascii="Times New Roman" w:hAnsi="Times New Roman" w:cs="Times New Roman"/>
+          <w:sz w:val="22"/>
+          <w:szCs w:val="22"/>
+        </w:rPr>
+        <w:t xml:space="preserve">configure an isolated NAT network to allow for communication between VMs, </w:t>
+      </w:r>
+      <w:r>
+        <w:rPr>
+          <w:rFonts w:ascii="Times New Roman" w:hAnsi="Times New Roman" w:cs="Times New Roman"/>
+          <w:sz w:val="22"/>
+          <w:szCs w:val="22"/>
+        </w:rPr>
+        <w:t>set up Windows Server 2022 to use Active Directory, create and manage user accounts within that domain, configure DNS settings across virtual machines, and join client machines to the domain</w:t>
+      </w:r>
+      <w:r>
+        <w:rPr>
+          <w:rFonts w:ascii="Times New Roman" w:hAnsi="Times New Roman" w:cs="Times New Roman"/>
+          <w:sz w:val="22"/>
+          <w:szCs w:val="22"/>
+        </w:rPr>
+        <w:t>.</w:t>
+      </w:r>
+    </w:p>
+    <w:p>
+      <w:pPr>
+        <w:spacing w:line="240" w:lineRule="auto"/>
+        <w:rPr>
+          <w:rFonts w:ascii="Times New Roman" w:hAnsi="Times New Roman" w:cs="Times New Roman"/>
+          <w:sz w:val="22"/>
+          <w:szCs w:val="22"/>
+        </w:rPr>
+      </w:pPr>
+    </w:p>
+    <w:p>
+      <w:pPr>
+        <w:spacing w:line="240" w:lineRule="auto"/>
+        <w:rPr>
+          <w:rFonts w:ascii="Times New Roman" w:hAnsi="Times New Roman" w:cs="Times New Roman"/>
+          <w:sz w:val="22"/>
+          <w:szCs w:val="22"/>
+        </w:rPr>
+      </w:pPr>
+      <w:r>
+        <w:rPr>
+          <w:rFonts w:ascii="Times New Roman" w:hAnsi="Times New Roman" w:cs="Times New Roman"/>
+          <w:sz w:val="22"/>
+          <w:szCs w:val="22"/>
+        </w:rPr>
+        <w:t>Virtual Box Installation</w:t>
+      </w:r>
+    </w:p>
+    <w:p>
+      <w:pPr>
+        <w:pStyle w:val="ListParagraph"/>
+        <w:numPr>
+          <w:ilvl w:val="0"/>
+          <w:numId w:val="17"/>
+        </w:numPr>
+        <w:spacing w:line="240" w:lineRule="auto"/>
+        <w:rPr>
+          <w:rFonts w:ascii="Times New Roman" w:hAnsi="Times New Roman" w:cs="Times New Roman"/>
+          <w:sz w:val="22"/>
+          <w:szCs w:val="22"/>
+        </w:rPr>
+      </w:pPr>
+      <w:r>
+        <w:rPr>
+          <w:rFonts w:ascii="Times New Roman" w:hAnsi="Times New Roman" w:cs="Times New Roman"/>
+          <w:sz w:val="22"/>
+          <w:szCs w:val="22"/>
+        </w:rPr>
+        <w:t>First thing you are going to want to do is d</w:t>
+      </w:r>
+      <w:r>
+        <w:rPr>
+          <w:rFonts w:ascii="Times New Roman" w:hAnsi="Times New Roman" w:cs="Times New Roman"/>
+          <w:sz w:val="22"/>
+          <w:szCs w:val="22"/>
+        </w:rPr>
+        <w:t>ownload</w:t>
+      </w:r>
+      <w:r>
+        <w:rPr>
+          <w:rFonts w:ascii="Times New Roman" w:hAnsi="Times New Roman" w:cs="Times New Roman"/>
+          <w:sz w:val="22"/>
+          <w:szCs w:val="22"/>
+        </w:rPr>
+        <w:t xml:space="preserve"> </w:t>
+      </w:r>
+      <w:r>
+        <w:rPr>
+          <w:rFonts w:ascii="Times New Roman" w:hAnsi="Times New Roman" w:cs="Times New Roman"/>
+          <w:sz w:val="22"/>
+          <w:szCs w:val="22"/>
+        </w:rPr>
+        <w:t xml:space="preserve">VirtualBox off the website </w:t>
       </w:r>
       <w:hyperlink r:id="rId8" w:history="1">
         <w:r>
@@ -482,12 +606,48 @@
             <w:sz w:val="22"/>
             <w:szCs w:val="22"/>
           </w:rPr>
-          <w:t>virtualbox.org</w:t>
+          <w:t>virtualb</w:t>
+        </w:r>
+        <w:r>
+          <w:rPr>
+            <w:rStyle w:val="Hyperlink"/>
+            <w:rFonts w:ascii="Times New Roman" w:hAnsi="Times New Roman" w:cs="Times New Roman"/>
+            <w:sz w:val="22"/>
+            <w:szCs w:val="22"/>
+          </w:rPr>
+          <w:t>o</w:t>
+        </w:r>
+        <w:r>
+          <w:rPr>
+            <w:rStyle w:val="Hyperlink"/>
+            <w:rFonts w:ascii="Times New Roman" w:hAnsi="Times New Roman" w:cs="Times New Roman"/>
+            <w:sz w:val="22"/>
+            <w:szCs w:val="22"/>
+          </w:rPr>
+          <w:t>x.org</w:t>
         </w:r>
       </w:hyperlink>
     </w:p>
     <w:p>
       <w:pPr>
+        <w:pStyle w:val="ListParagraph"/>
+        <w:numPr>
+          <w:ilvl w:val="0"/>
+          <w:numId w:val="17"/>
+        </w:numPr>
+        <w:spacing w:line="240" w:lineRule="auto"/>
+        <w:rPr>
+          <w:rFonts w:ascii="Times New Roman" w:hAnsi="Times New Roman" w:cs="Times New Roman"/>
+          <w:sz w:val="22"/>
+          <w:szCs w:val="22"/>
+        </w:rPr>
+      </w:pPr>
+      <w:r>
+        <w:t>Click the “Download” button and then click “windows hosts” It is now going to download for you.</w:t>
+      </w:r>
+    </w:p>
+    <w:p>
+      <w:pPr>
         <w:spacing w:line="240" w:lineRule="auto"/>
         <w:ind w:left="360"/>
         <w:rPr>
@@ -514,9 +674,9 @@
           <w:szCs w:val="22"/>
         </w:rPr>
         <w:drawing>
-          <wp:inline distT="0" distB="0" distL="0" distR="0" wp14:anchorId="12FAC6A6" wp14:editId="1C52C374">
-            <wp:extent cx="5943600" cy="2893060"/>
-            <wp:effectExtent l="0" t="0" r="0" b="2540"/>
+          <wp:inline distT="0" distB="0" distL="0" distR="0" wp14:anchorId="12FAC6A6" wp14:editId="3A8BE4BD">
+            <wp:extent cx="3162300" cy="1539256"/>
+            <wp:effectExtent l="0" t="0" r="0" b="3810"/>
             <wp:docPr id="618932165" name="Picture 1"/>
             <wp:cNvGraphicFramePr>
               <a:graphicFrameLocks xmlns:a="http://schemas.openxmlformats.org/drawingml/2006/main" noChangeAspect="1"/>
@@ -537,7 +697,7 @@
                   <pic:spPr>
                     <a:xfrm>
                       <a:off x="0" y="0"/>
-                      <a:ext cx="5943600" cy="2893060"/>
+                      <a:ext cx="3171711" cy="1543837"/>
                     </a:xfrm>
                     <a:prstGeom prst="rect">
                       <a:avLst/>
@@ -552,29 +712,48 @@
     </w:p>
     <w:p>
       <w:pPr>
-        <w:spacing w:line="240" w:lineRule="auto"/>
-        <w:rPr>
-          <w:rFonts w:ascii="Times New Roman" w:hAnsi="Times New Roman" w:cs="Times New Roman"/>
-          <w:sz w:val="22"/>
-          <w:szCs w:val="22"/>
-        </w:rPr>
-      </w:pPr>
-    </w:p>
-    <w:p>
-      <w:pPr>
-        <w:spacing w:line="240" w:lineRule="auto"/>
-        <w:rPr>
-          <w:rFonts w:ascii="Times New Roman" w:hAnsi="Times New Roman" w:cs="Times New Roman"/>
-          <w:sz w:val="22"/>
-          <w:szCs w:val="22"/>
-        </w:rPr>
-      </w:pPr>
-      <w:r>
-        <w:rPr>
-          <w:rFonts w:ascii="Times New Roman" w:hAnsi="Times New Roman" w:cs="Times New Roman"/>
-          <w:sz w:val="22"/>
-          <w:szCs w:val="22"/>
-        </w:rPr>
+        <w:pStyle w:val="ListParagraph"/>
+        <w:numPr>
+          <w:ilvl w:val="0"/>
+          <w:numId w:val="17"/>
+        </w:numPr>
+        <w:spacing w:line="240" w:lineRule="auto"/>
+        <w:rPr>
+          <w:rFonts w:ascii="Times New Roman" w:hAnsi="Times New Roman" w:cs="Times New Roman"/>
+          <w:sz w:val="22"/>
+          <w:szCs w:val="22"/>
+        </w:rPr>
+      </w:pPr>
+      <w:r>
+        <w:rPr>
+          <w:rFonts w:ascii="Times New Roman" w:hAnsi="Times New Roman" w:cs="Times New Roman"/>
+          <w:sz w:val="22"/>
+          <w:szCs w:val="22"/>
+        </w:rPr>
+        <w:t>Now click on the download and when the pop up appears on your screen click yes. Continue through the screens of the pop up for installation and when done click “Finish”, you have now downloaded VirtualBox.</w:t>
+      </w:r>
+    </w:p>
+    <w:p>
+      <w:pPr>
+        <w:pStyle w:val="ListParagraph"/>
+        <w:numPr>
+          <w:ilvl w:val="0"/>
+          <w:numId w:val="17"/>
+        </w:numPr>
+        <w:spacing w:line="240" w:lineRule="auto"/>
+        <w:rPr>
+          <w:rFonts w:ascii="Times New Roman" w:hAnsi="Times New Roman" w:cs="Times New Roman"/>
+          <w:sz w:val="22"/>
+          <w:szCs w:val="22"/>
+        </w:rPr>
+      </w:pPr>
+      <w:r>
+        <w:rPr>
+          <w:rFonts w:ascii="Times New Roman" w:hAnsi="Times New Roman" w:cs="Times New Roman"/>
+          <w:sz w:val="22"/>
+          <w:szCs w:val="22"/>
+        </w:rPr>
+        <w:lastRenderedPageBreak/>
         <w:t xml:space="preserve">Now that you have downloaded VirtualBox you can proceed with the Windows Server 2022 </w:t>
       </w:r>
       <w:r>
@@ -655,7 +834,6 @@
           <w:sz w:val="22"/>
           <w:szCs w:val="22"/>
         </w:rPr>
-        <w:lastRenderedPageBreak/>
         <w:t xml:space="preserve">Click this link to be sent to the Windows Server 2022 ISO download page: </w:t>
       </w:r>
       <w:hyperlink r:id="rId10" w:history="1">
@@ -690,7 +868,39 @@
           <w:sz w:val="22"/>
           <w:szCs w:val="22"/>
         </w:rPr>
-        <w:t>There will be a Try Windows Server now button. Once you click that, there will be another like Download free trial of Windows Server 2022. After clicking that link, it will bring you to a page with the ISO download.</w:t>
+        <w:t xml:space="preserve">There will be a Try Windows Server now button. Once you click that, there will be another </w:t>
+      </w:r>
+      <w:r>
+        <w:rPr>
+          <w:rFonts w:ascii="Times New Roman" w:hAnsi="Times New Roman" w:cs="Times New Roman"/>
+          <w:sz w:val="22"/>
+          <w:szCs w:val="22"/>
+        </w:rPr>
+        <w:t>“</w:t>
+      </w:r>
+      <w:r>
+        <w:rPr>
+          <w:rFonts w:ascii="Times New Roman" w:hAnsi="Times New Roman" w:cs="Times New Roman"/>
+          <w:sz w:val="22"/>
+          <w:szCs w:val="22"/>
+        </w:rPr>
+        <w:t>Download free trial of Windows Server 2022</w:t>
+      </w:r>
+      <w:r>
+        <w:rPr>
+          <w:rFonts w:ascii="Times New Roman" w:hAnsi="Times New Roman" w:cs="Times New Roman"/>
+          <w:sz w:val="22"/>
+          <w:szCs w:val="22"/>
+        </w:rPr>
+        <w:t>”</w:t>
+      </w:r>
+      <w:r>
+        <w:rPr>
+          <w:rFonts w:ascii="Times New Roman" w:hAnsi="Times New Roman" w:cs="Times New Roman"/>
+          <w:sz w:val="22"/>
+          <w:szCs w:val="22"/>
+        </w:rPr>
+        <w:t>. After clicking that link, it will bring you to a page with the ISO download.</w:t>
       </w:r>
     </w:p>
     <w:p>
@@ -1001,9 +1211,9 @@
         </w:rPr>
         <w:lastRenderedPageBreak/>
         <w:drawing>
-          <wp:inline distT="0" distB="0" distL="0" distR="0" wp14:anchorId="127E02FF" wp14:editId="67BAFA59">
-            <wp:extent cx="5943600" cy="4035425"/>
-            <wp:effectExtent l="0" t="0" r="0" b="3175"/>
+          <wp:inline distT="0" distB="0" distL="0" distR="0" wp14:anchorId="127E02FF" wp14:editId="6E988226">
+            <wp:extent cx="4337050" cy="2944653"/>
+            <wp:effectExtent l="0" t="0" r="6350" b="8255"/>
             <wp:docPr id="241585493" name="Picture 1"/>
             <wp:cNvGraphicFramePr>
               <a:graphicFrameLocks xmlns:a="http://schemas.openxmlformats.org/drawingml/2006/main" noChangeAspect="1"/>
@@ -1024,7 +1234,7 @@
                   <pic:spPr>
                     <a:xfrm>
                       <a:off x="0" y="0"/>
-                      <a:ext cx="5943600" cy="4035425"/>
+                      <a:ext cx="4338514" cy="2945647"/>
                     </a:xfrm>
                     <a:prstGeom prst="rect">
                       <a:avLst/>
@@ -1054,9 +1264,9 @@
           <w:szCs w:val="22"/>
         </w:rPr>
         <w:drawing>
-          <wp:inline distT="0" distB="0" distL="0" distR="0" wp14:anchorId="79658689" wp14:editId="25FB7466">
-            <wp:extent cx="5943600" cy="4080510"/>
-            <wp:effectExtent l="0" t="0" r="0" b="0"/>
+          <wp:inline distT="0" distB="0" distL="0" distR="0" wp14:anchorId="79658689" wp14:editId="073CC5E4">
+            <wp:extent cx="4263927" cy="2927350"/>
+            <wp:effectExtent l="0" t="0" r="3810" b="6350"/>
             <wp:docPr id="1680118553" name="Picture 1"/>
             <wp:cNvGraphicFramePr>
               <a:graphicFrameLocks xmlns:a="http://schemas.openxmlformats.org/drawingml/2006/main" noChangeAspect="1"/>
@@ -1077,7 +1287,7 @@
                   <pic:spPr>
                     <a:xfrm>
                       <a:off x="0" y="0"/>
-                      <a:ext cx="5943600" cy="4080510"/>
+                      <a:ext cx="4269239" cy="2930997"/>
                     </a:xfrm>
                     <a:prstGeom prst="rect">
                       <a:avLst/>
@@ -1108,9 +1318,9 @@
         </w:rPr>
         <w:lastRenderedPageBreak/>
         <w:drawing>
-          <wp:inline distT="0" distB="0" distL="0" distR="0" wp14:anchorId="654D39F2" wp14:editId="5EB4DE5E">
-            <wp:extent cx="2578233" cy="4426177"/>
-            <wp:effectExtent l="0" t="0" r="0" b="0"/>
+          <wp:inline distT="0" distB="0" distL="0" distR="0" wp14:anchorId="654D39F2" wp14:editId="3814562C">
+            <wp:extent cx="1305695" cy="2241550"/>
+            <wp:effectExtent l="0" t="0" r="8890" b="6350"/>
             <wp:docPr id="1909546619" name="Picture 1"/>
             <wp:cNvGraphicFramePr>
               <a:graphicFrameLocks xmlns:a="http://schemas.openxmlformats.org/drawingml/2006/main" noChangeAspect="1"/>
@@ -1131,7 +1341,7 @@
                   <pic:spPr>
                     <a:xfrm>
                       <a:off x="0" y="0"/>
-                      <a:ext cx="2578233" cy="4426177"/>
+                      <a:ext cx="1310249" cy="2249369"/>
                     </a:xfrm>
                     <a:prstGeom prst="rect">
                       <a:avLst/>
@@ -1242,11 +1452,10 @@
           <w:sz w:val="22"/>
           <w:szCs w:val="22"/>
         </w:rPr>
-        <w:lastRenderedPageBreak/>
         <w:drawing>
-          <wp:inline distT="0" distB="0" distL="0" distR="0" wp14:anchorId="263FD882" wp14:editId="6ED4E93B">
-            <wp:extent cx="5943600" cy="4592955"/>
-            <wp:effectExtent l="0" t="0" r="0" b="0"/>
+          <wp:inline distT="0" distB="0" distL="0" distR="0" wp14:anchorId="263FD882" wp14:editId="3C08FBC7">
+            <wp:extent cx="3879850" cy="2998179"/>
+            <wp:effectExtent l="0" t="0" r="6350" b="0"/>
             <wp:docPr id="898338146" name="Picture 1"/>
             <wp:cNvGraphicFramePr>
               <a:graphicFrameLocks xmlns:a="http://schemas.openxmlformats.org/drawingml/2006/main" noChangeAspect="1"/>
@@ -1267,7 +1476,7 @@
                   <pic:spPr>
                     <a:xfrm>
                       <a:off x="0" y="0"/>
-                      <a:ext cx="5943600" cy="4592955"/>
+                      <a:ext cx="3883567" cy="3001051"/>
                     </a:xfrm>
                     <a:prstGeom prst="rect">
                       <a:avLst/>
@@ -1339,8 +1548,8 @@
         </w:rPr>
         <w:lastRenderedPageBreak/>
         <w:drawing>
-          <wp:inline distT="0" distB="0" distL="0" distR="0" wp14:anchorId="40D3724A" wp14:editId="0AD46909">
-            <wp:extent cx="5677192" cy="4159464"/>
+          <wp:inline distT="0" distB="0" distL="0" distR="0" wp14:anchorId="40D3724A" wp14:editId="06816DB0">
+            <wp:extent cx="3700819" cy="2711450"/>
             <wp:effectExtent l="0" t="0" r="0" b="0"/>
             <wp:docPr id="986710468" name="Picture 1"/>
             <wp:cNvGraphicFramePr>
@@ -1362,7 +1571,7 @@
                   <pic:spPr>
                     <a:xfrm>
                       <a:off x="0" y="0"/>
-                      <a:ext cx="5677192" cy="4159464"/>
+                      <a:ext cx="3704949" cy="2714476"/>
                     </a:xfrm>
                     <a:prstGeom prst="rect">
                       <a:avLst/>
@@ -1434,11 +1643,10 @@
           <w:sz w:val="22"/>
           <w:szCs w:val="22"/>
         </w:rPr>
-        <w:lastRenderedPageBreak/>
         <w:drawing>
-          <wp:inline distT="0" distB="0" distL="0" distR="0" wp14:anchorId="7CE48A4C" wp14:editId="669A7E2B">
-            <wp:extent cx="5397777" cy="3949903"/>
-            <wp:effectExtent l="0" t="0" r="0" b="0"/>
+          <wp:inline distT="0" distB="0" distL="0" distR="0" wp14:anchorId="7CE48A4C" wp14:editId="3BF11CA5">
+            <wp:extent cx="3663950" cy="2681149"/>
+            <wp:effectExtent l="0" t="0" r="0" b="5080"/>
             <wp:docPr id="470990325" name="Picture 1"/>
             <wp:cNvGraphicFramePr>
               <a:graphicFrameLocks xmlns:a="http://schemas.openxmlformats.org/drawingml/2006/main" noChangeAspect="1"/>
@@ -1459,7 +1667,7 @@
                   <pic:spPr>
                     <a:xfrm>
                       <a:off x="0" y="0"/>
-                      <a:ext cx="5397777" cy="3949903"/>
+                      <a:ext cx="3675674" cy="2689729"/>
                     </a:xfrm>
                     <a:prstGeom prst="rect">
                       <a:avLst/>
@@ -1531,10 +1739,11 @@
           <w:sz w:val="22"/>
           <w:szCs w:val="22"/>
         </w:rPr>
+        <w:lastRenderedPageBreak/>
         <w:drawing>
-          <wp:inline distT="0" distB="0" distL="0" distR="0" wp14:anchorId="5A936808" wp14:editId="6BA23C9F">
-            <wp:extent cx="4332083" cy="2346082"/>
-            <wp:effectExtent l="0" t="0" r="0" b="0"/>
+          <wp:inline distT="0" distB="0" distL="0" distR="0" wp14:anchorId="5A936808" wp14:editId="5F6FB6CE">
+            <wp:extent cx="3302000" cy="1788231"/>
+            <wp:effectExtent l="0" t="0" r="0" b="2540"/>
             <wp:docPr id="2117820149" name="Picture 1"/>
             <wp:cNvGraphicFramePr>
               <a:graphicFrameLocks xmlns:a="http://schemas.openxmlformats.org/drawingml/2006/main" noChangeAspect="1"/>
@@ -1555,7 +1764,7 @@
                   <pic:spPr>
                     <a:xfrm>
                       <a:off x="0" y="0"/>
-                      <a:ext cx="4339016" cy="2349837"/>
+                      <a:ext cx="3321175" cy="1798615"/>
                     </a:xfrm>
                     <a:prstGeom prst="rect">
                       <a:avLst/>
@@ -1616,7 +1825,6 @@
           <w:sz w:val="22"/>
           <w:szCs w:val="22"/>
         </w:rPr>
-        <w:lastRenderedPageBreak/>
         <w:t>Windows 11 Installation</w:t>
       </w:r>
     </w:p>
@@ -1671,16 +1879,14 @@
         </w:rPr>
         <w:t xml:space="preserve"> add </w:t>
       </w:r>
-      <w:proofErr w:type="gramStart"/>
-      <w:r>
-        <w:rPr>
-          <w:rFonts w:ascii="Times New Roman" w:hAnsi="Times New Roman" w:cs="Times New Roman"/>
-          <w:sz w:val="22"/>
-          <w:szCs w:val="22"/>
-        </w:rPr>
-        <w:t>a Windows</w:t>
-      </w:r>
-      <w:proofErr w:type="gramEnd"/>
+      <w:r>
+        <w:rPr>
+          <w:rFonts w:ascii="Times New Roman" w:hAnsi="Times New Roman" w:cs="Times New Roman"/>
+          <w:sz w:val="22"/>
+          <w:szCs w:val="22"/>
+        </w:rPr>
+        <w:t>Windows</w:t>
+      </w:r>
       <w:r>
         <w:rPr>
           <w:rFonts w:ascii="Times New Roman" w:hAnsi="Times New Roman" w:cs="Times New Roman"/>
@@ -1760,9 +1966,9 @@
           <w:szCs w:val="22"/>
         </w:rPr>
         <w:drawing>
-          <wp:inline distT="0" distB="0" distL="0" distR="0" wp14:anchorId="2AE9D341" wp14:editId="1F805CA6">
-            <wp:extent cx="5943600" cy="3539490"/>
-            <wp:effectExtent l="0" t="0" r="0" b="3810"/>
+          <wp:inline distT="0" distB="0" distL="0" distR="0" wp14:anchorId="2AE9D341" wp14:editId="2CC5A741">
+            <wp:extent cx="4030644" cy="2400300"/>
+            <wp:effectExtent l="0" t="0" r="8255" b="0"/>
             <wp:docPr id="1841199091" name="Picture 1"/>
             <wp:cNvGraphicFramePr>
               <a:graphicFrameLocks xmlns:a="http://schemas.openxmlformats.org/drawingml/2006/main" noChangeAspect="1"/>
@@ -1783,7 +1989,7 @@
                   <pic:spPr>
                     <a:xfrm>
                       <a:off x="0" y="0"/>
-                      <a:ext cx="5943600" cy="3539490"/>
+                      <a:ext cx="4036068" cy="2403530"/>
                     </a:xfrm>
                     <a:prstGeom prst="rect">
                       <a:avLst/>
@@ -1924,9 +2130,9 @@
         </w:rPr>
         <w:lastRenderedPageBreak/>
         <w:drawing>
-          <wp:inline distT="0" distB="0" distL="0" distR="0" wp14:anchorId="4CD4BD55" wp14:editId="7AEC01CC">
-            <wp:extent cx="5880141" cy="4006158"/>
-            <wp:effectExtent l="0" t="0" r="6350" b="0"/>
+          <wp:inline distT="0" distB="0" distL="0" distR="0" wp14:anchorId="4CD4BD55" wp14:editId="78106BF3">
+            <wp:extent cx="4286250" cy="2920235"/>
+            <wp:effectExtent l="0" t="0" r="0" b="0"/>
             <wp:docPr id="258793204" name="Picture 1"/>
             <wp:cNvGraphicFramePr>
               <a:graphicFrameLocks xmlns:a="http://schemas.openxmlformats.org/drawingml/2006/main" noChangeAspect="1"/>
@@ -1947,7 +2153,7 @@
                   <pic:spPr>
                     <a:xfrm>
                       <a:off x="0" y="0"/>
-                      <a:ext cx="5914972" cy="4029888"/>
+                      <a:ext cx="4320678" cy="2943691"/>
                     </a:xfrm>
                     <a:prstGeom prst="rect">
                       <a:avLst/>
@@ -2012,7 +2218,6 @@
     <w:p>
       <w:pPr>
         <w:spacing w:line="240" w:lineRule="auto"/>
-        <w:ind w:firstLine="720"/>
         <w:rPr>
           <w:rFonts w:ascii="Times New Roman" w:hAnsi="Times New Roman" w:cs="Times New Roman"/>
           <w:sz w:val="22"/>
@@ -2026,11 +2231,10 @@
           <w:sz w:val="22"/>
           <w:szCs w:val="22"/>
         </w:rPr>
-        <w:lastRenderedPageBreak/>
         <w:drawing>
-          <wp:inline distT="0" distB="0" distL="0" distR="0" wp14:anchorId="2E7803EF" wp14:editId="39C5B2D6">
-            <wp:extent cx="5943600" cy="5174615"/>
-            <wp:effectExtent l="0" t="0" r="0" b="6985"/>
+          <wp:inline distT="0" distB="0" distL="0" distR="0" wp14:anchorId="2E7803EF" wp14:editId="659BB14C">
+            <wp:extent cx="3498850" cy="3046168"/>
+            <wp:effectExtent l="0" t="0" r="6350" b="1905"/>
             <wp:docPr id="1647863349" name="Picture 1"/>
             <wp:cNvGraphicFramePr>
               <a:graphicFrameLocks xmlns:a="http://schemas.openxmlformats.org/drawingml/2006/main" noChangeAspect="1"/>
@@ -2051,7 +2255,7 @@
                   <pic:spPr>
                     <a:xfrm>
                       <a:off x="0" y="0"/>
-                      <a:ext cx="5943600" cy="5174615"/>
+                      <a:ext cx="3510913" cy="3056670"/>
                     </a:xfrm>
                     <a:prstGeom prst="rect">
                       <a:avLst/>
@@ -2092,24 +2296,14 @@
         </w:rPr>
         <w:t xml:space="preserve">I found myself having trouble trying to load the ISO onto the VM so that it would boot correctly. I found out through a little research that I should </w:t>
       </w:r>
-      <w:proofErr w:type="gramStart"/>
-      <w:r>
-        <w:rPr>
-          <w:rFonts w:ascii="Times New Roman" w:hAnsi="Times New Roman" w:cs="Times New Roman"/>
-          <w:sz w:val="22"/>
-          <w:szCs w:val="22"/>
-        </w:rPr>
-        <w:t>a</w:t>
-      </w:r>
-      <w:r>
-        <w:rPr>
-          <w:rFonts w:ascii="Times New Roman" w:hAnsi="Times New Roman" w:cs="Times New Roman"/>
-          <w:sz w:val="22"/>
-          <w:szCs w:val="22"/>
-        </w:rPr>
-        <w:t>ctually leave</w:t>
-      </w:r>
-      <w:proofErr w:type="gramEnd"/>
+      <w:r>
+        <w:rPr>
+          <w:rFonts w:ascii="Times New Roman" w:hAnsi="Times New Roman" w:cs="Times New Roman"/>
+          <w:sz w:val="22"/>
+          <w:szCs w:val="22"/>
+        </w:rPr>
+        <w:t>leave</w:t>
+      </w:r>
       <w:r>
         <w:rPr>
           <w:rFonts w:ascii="Times New Roman" w:hAnsi="Times New Roman" w:cs="Times New Roman"/>
@@ -2151,6 +2345,7 @@
           <w:sz w:val="22"/>
           <w:szCs w:val="22"/>
         </w:rPr>
+        <w:lastRenderedPageBreak/>
         <w:t>So,</w:t>
       </w:r>
       <w:r>
@@ -2226,11 +2421,10 @@
           <w:sz w:val="22"/>
           <w:szCs w:val="22"/>
         </w:rPr>
-        <w:lastRenderedPageBreak/>
         <w:drawing>
-          <wp:inline distT="0" distB="0" distL="0" distR="0" wp14:anchorId="5D35E222" wp14:editId="76533737">
-            <wp:extent cx="5943600" cy="5229860"/>
-            <wp:effectExtent l="0" t="0" r="0" b="8890"/>
+          <wp:inline distT="0" distB="0" distL="0" distR="0" wp14:anchorId="5D35E222" wp14:editId="723F1C16">
+            <wp:extent cx="3514489" cy="3092450"/>
+            <wp:effectExtent l="0" t="0" r="0" b="0"/>
             <wp:docPr id="584803680" name="Picture 1"/>
             <wp:cNvGraphicFramePr>
               <a:graphicFrameLocks xmlns:a="http://schemas.openxmlformats.org/drawingml/2006/main" noChangeAspect="1"/>
@@ -2251,7 +2445,7 @@
                   <pic:spPr>
                     <a:xfrm>
                       <a:off x="0" y="0"/>
-                      <a:ext cx="5943600" cy="5229860"/>
+                      <a:ext cx="3518773" cy="3096220"/>
                     </a:xfrm>
                     <a:prstGeom prst="rect">
                       <a:avLst/>
@@ -2329,11 +2523,10 @@
           <w:sz w:val="22"/>
           <w:szCs w:val="22"/>
         </w:rPr>
-        <w:lastRenderedPageBreak/>
         <w:drawing>
-          <wp:inline distT="0" distB="0" distL="0" distR="0" wp14:anchorId="209FBA9C" wp14:editId="19845EF2">
-            <wp:extent cx="5943600" cy="5160010"/>
-            <wp:effectExtent l="0" t="0" r="0" b="2540"/>
+          <wp:inline distT="0" distB="0" distL="0" distR="0" wp14:anchorId="209FBA9C" wp14:editId="4730BE72">
+            <wp:extent cx="3349949" cy="2908300"/>
+            <wp:effectExtent l="0" t="0" r="3175" b="6350"/>
             <wp:docPr id="809259510" name="Picture 1"/>
             <wp:cNvGraphicFramePr>
               <a:graphicFrameLocks xmlns:a="http://schemas.openxmlformats.org/drawingml/2006/main" noChangeAspect="1"/>
@@ -2354,7 +2547,7 @@
                   <pic:spPr>
                     <a:xfrm>
                       <a:off x="0" y="0"/>
-                      <a:ext cx="5943600" cy="5160010"/>
+                      <a:ext cx="3353286" cy="2911197"/>
                     </a:xfrm>
                     <a:prstGeom prst="rect">
                       <a:avLst/>
@@ -2426,8 +2619,8 @@
         </w:rPr>
         <w:lastRenderedPageBreak/>
         <w:drawing>
-          <wp:inline distT="0" distB="0" distL="0" distR="0" wp14:anchorId="4B21E328" wp14:editId="7B5A894C">
-            <wp:extent cx="5943600" cy="5130165"/>
+          <wp:inline distT="0" distB="0" distL="0" distR="0" wp14:anchorId="4B21E328" wp14:editId="08A2ABD1">
+            <wp:extent cx="3509219" cy="3028950"/>
             <wp:effectExtent l="0" t="0" r="0" b="0"/>
             <wp:docPr id="1462910840" name="Picture 1"/>
             <wp:cNvGraphicFramePr>
@@ -2449,7 +2642,7 @@
                   <pic:spPr>
                     <a:xfrm>
                       <a:off x="0" y="0"/>
-                      <a:ext cx="5943600" cy="5130165"/>
+                      <a:ext cx="3515175" cy="3034091"/>
                     </a:xfrm>
                     <a:prstGeom prst="rect">
                       <a:avLst/>
@@ -2511,11 +2704,10 @@
           <w:sz w:val="22"/>
           <w:szCs w:val="22"/>
         </w:rPr>
-        <w:lastRenderedPageBreak/>
         <w:drawing>
-          <wp:inline distT="0" distB="0" distL="0" distR="0" wp14:anchorId="53D950F1" wp14:editId="02A4CCAC">
-            <wp:extent cx="5943600" cy="5181600"/>
-            <wp:effectExtent l="0" t="0" r="0" b="0"/>
+          <wp:inline distT="0" distB="0" distL="0" distR="0" wp14:anchorId="53D950F1" wp14:editId="071DDB93">
+            <wp:extent cx="3503519" cy="3054350"/>
+            <wp:effectExtent l="0" t="0" r="1905" b="0"/>
             <wp:docPr id="354780726" name="Picture 1"/>
             <wp:cNvGraphicFramePr>
               <a:graphicFrameLocks xmlns:a="http://schemas.openxmlformats.org/drawingml/2006/main" noChangeAspect="1"/>
@@ -2536,7 +2728,7 @@
                   <pic:spPr>
                     <a:xfrm>
                       <a:off x="0" y="0"/>
-                      <a:ext cx="5943600" cy="5181600"/>
+                      <a:ext cx="3505811" cy="3056348"/>
                     </a:xfrm>
                     <a:prstGeom prst="rect">
                       <a:avLst/>
@@ -2600,9 +2792,9 @@
         </w:rPr>
         <w:lastRenderedPageBreak/>
         <w:drawing>
-          <wp:inline distT="0" distB="0" distL="0" distR="0" wp14:anchorId="72378F39" wp14:editId="6D2CCA2A">
-            <wp:extent cx="5943600" cy="5181600"/>
-            <wp:effectExtent l="0" t="0" r="0" b="0"/>
+          <wp:inline distT="0" distB="0" distL="0" distR="0" wp14:anchorId="72378F39" wp14:editId="6CBC95C2">
+            <wp:extent cx="3155950" cy="2751341"/>
+            <wp:effectExtent l="0" t="0" r="6350" b="0"/>
             <wp:docPr id="48724356" name="Picture 1"/>
             <wp:cNvGraphicFramePr>
               <a:graphicFrameLocks xmlns:a="http://schemas.openxmlformats.org/drawingml/2006/main" noChangeAspect="1"/>
@@ -2623,7 +2815,7 @@
                   <pic:spPr>
                     <a:xfrm>
                       <a:off x="0" y="0"/>
-                      <a:ext cx="5943600" cy="5181600"/>
+                      <a:ext cx="3160584" cy="2755381"/>
                     </a:xfrm>
                     <a:prstGeom prst="rect">
                       <a:avLst/>
@@ -2767,11 +2959,10 @@
           <w:sz w:val="22"/>
           <w:szCs w:val="22"/>
         </w:rPr>
-        <w:lastRenderedPageBreak/>
         <w:drawing>
-          <wp:inline distT="0" distB="0" distL="0" distR="0" wp14:anchorId="0E25D27D" wp14:editId="23A9CE99">
-            <wp:extent cx="5943600" cy="4981575"/>
-            <wp:effectExtent l="0" t="0" r="0" b="9525"/>
+          <wp:inline distT="0" distB="0" distL="0" distR="0" wp14:anchorId="0E25D27D" wp14:editId="1ABD12D1">
+            <wp:extent cx="3356297" cy="2813050"/>
+            <wp:effectExtent l="0" t="0" r="0" b="6350"/>
             <wp:docPr id="142492543" name="Picture 1"/>
             <wp:cNvGraphicFramePr>
               <a:graphicFrameLocks xmlns:a="http://schemas.openxmlformats.org/drawingml/2006/main" noChangeAspect="1"/>
@@ -2792,7 +2983,7 @@
                   <pic:spPr>
                     <a:xfrm>
                       <a:off x="0" y="0"/>
-                      <a:ext cx="5943600" cy="4981575"/>
+                      <a:ext cx="3362678" cy="2818398"/>
                     </a:xfrm>
                     <a:prstGeom prst="rect">
                       <a:avLst/>
@@ -2856,8 +3047,8 @@
         </w:rPr>
         <w:lastRenderedPageBreak/>
         <w:drawing>
-          <wp:inline distT="0" distB="0" distL="0" distR="0" wp14:anchorId="03A8142F" wp14:editId="017C47B1">
-            <wp:extent cx="5943600" cy="4994910"/>
+          <wp:inline distT="0" distB="0" distL="0" distR="0" wp14:anchorId="03A8142F" wp14:editId="1E811D4B">
+            <wp:extent cx="3150879" cy="2647950"/>
             <wp:effectExtent l="0" t="0" r="0" b="0"/>
             <wp:docPr id="959997666" name="Picture 1"/>
             <wp:cNvGraphicFramePr>
@@ -2879,7 +3070,7 @@
                   <pic:spPr>
                     <a:xfrm>
                       <a:off x="0" y="0"/>
-                      <a:ext cx="5943600" cy="4994910"/>
+                      <a:ext cx="3163120" cy="2658237"/>
                     </a:xfrm>
                     <a:prstGeom prst="rect">
                       <a:avLst/>
@@ -2975,11 +3166,10 @@
           <w:sz w:val="22"/>
           <w:szCs w:val="22"/>
         </w:rPr>
-        <w:lastRenderedPageBreak/>
         <w:drawing>
-          <wp:inline distT="0" distB="0" distL="0" distR="0" wp14:anchorId="2250863E" wp14:editId="1D6D8BA5">
-            <wp:extent cx="5943600" cy="5041265"/>
-            <wp:effectExtent l="0" t="0" r="0" b="6985"/>
+          <wp:inline distT="0" distB="0" distL="0" distR="0" wp14:anchorId="2250863E" wp14:editId="340E8352">
+            <wp:extent cx="3295650" cy="2795317"/>
+            <wp:effectExtent l="0" t="0" r="0" b="5080"/>
             <wp:docPr id="1769756104" name="Picture 1"/>
             <wp:cNvGraphicFramePr>
               <a:graphicFrameLocks xmlns:a="http://schemas.openxmlformats.org/drawingml/2006/main" noChangeAspect="1"/>
@@ -3000,7 +3190,7 @@
                   <pic:spPr>
                     <a:xfrm>
                       <a:off x="0" y="0"/>
-                      <a:ext cx="5943600" cy="5041265"/>
+                      <a:ext cx="3297644" cy="2797008"/>
                     </a:xfrm>
                     <a:prstGeom prst="rect">
                       <a:avLst/>
@@ -3112,8 +3302,8 @@
         </w:rPr>
         <w:lastRenderedPageBreak/>
         <w:drawing>
-          <wp:inline distT="0" distB="0" distL="0" distR="0" wp14:anchorId="5C776D83" wp14:editId="52C48E79">
-            <wp:extent cx="5943600" cy="4942205"/>
+          <wp:inline distT="0" distB="0" distL="0" distR="0" wp14:anchorId="5C776D83" wp14:editId="12CCA395">
+            <wp:extent cx="3833595" cy="3187700"/>
             <wp:effectExtent l="0" t="0" r="0" b="0"/>
             <wp:docPr id="520281773" name="Picture 1"/>
             <wp:cNvGraphicFramePr>
@@ -3135,7 +3325,7 @@
                   <pic:spPr>
                     <a:xfrm>
                       <a:off x="0" y="0"/>
-                      <a:ext cx="5943600" cy="4942205"/>
+                      <a:ext cx="3838048" cy="3191403"/>
                     </a:xfrm>
                     <a:prstGeom prst="rect">
                       <a:avLst/>
@@ -3348,7 +3538,6 @@
           <w:sz w:val="22"/>
           <w:szCs w:val="22"/>
         </w:rPr>
-        <w:lastRenderedPageBreak/>
         <w:drawing>
           <wp:inline distT="0" distB="0" distL="0" distR="0" wp14:anchorId="268BD8BC" wp14:editId="47AA87D8">
             <wp:extent cx="2833734" cy="2032054"/>
@@ -3418,6 +3607,7 @@
           <w:sz w:val="22"/>
           <w:szCs w:val="22"/>
         </w:rPr>
+        <w:lastRenderedPageBreak/>
         <w:t xml:space="preserve">Copy the above settings. If you do not have a </w:t>
       </w:r>
       <w:proofErr w:type="spellStart"/>
@@ -3708,11 +3898,10 @@
           <w:sz w:val="22"/>
           <w:szCs w:val="22"/>
         </w:rPr>
-        <w:lastRenderedPageBreak/>
         <w:drawing>
-          <wp:inline distT="0" distB="0" distL="0" distR="0" wp14:anchorId="1B4E5CA5" wp14:editId="03C98133">
-            <wp:extent cx="5943600" cy="5146040"/>
-            <wp:effectExtent l="0" t="0" r="0" b="0"/>
+          <wp:inline distT="0" distB="0" distL="0" distR="0" wp14:anchorId="1B4E5CA5" wp14:editId="761DCF5C">
+            <wp:extent cx="3714750" cy="3216275"/>
+            <wp:effectExtent l="0" t="0" r="0" b="3175"/>
             <wp:docPr id="481491483" name="Picture 1"/>
             <wp:cNvGraphicFramePr>
               <a:graphicFrameLocks xmlns:a="http://schemas.openxmlformats.org/drawingml/2006/main" noChangeAspect="1"/>
@@ -3733,7 +3922,7 @@
                   <pic:spPr>
                     <a:xfrm>
                       <a:off x="0" y="0"/>
-                      <a:ext cx="5943600" cy="5146040"/>
+                      <a:ext cx="3717197" cy="3218394"/>
                     </a:xfrm>
                     <a:prstGeom prst="rect">
                       <a:avLst/>
@@ -3821,9 +4010,9 @@
         </w:rPr>
         <w:lastRenderedPageBreak/>
         <w:drawing>
-          <wp:inline distT="0" distB="0" distL="0" distR="0" wp14:anchorId="62E8806E" wp14:editId="41079F37">
-            <wp:extent cx="6104059" cy="5323438"/>
-            <wp:effectExtent l="0" t="0" r="0" b="0"/>
+          <wp:inline distT="0" distB="0" distL="0" distR="0" wp14:anchorId="62E8806E" wp14:editId="07751FDD">
+            <wp:extent cx="3633296" cy="3168650"/>
+            <wp:effectExtent l="0" t="0" r="5715" b="0"/>
             <wp:docPr id="530072280" name="Picture 1"/>
             <wp:cNvGraphicFramePr>
               <a:graphicFrameLocks xmlns:a="http://schemas.openxmlformats.org/drawingml/2006/main" noChangeAspect="1"/>
@@ -3844,7 +4033,7 @@
                   <pic:spPr>
                     <a:xfrm>
                       <a:off x="0" y="0"/>
-                      <a:ext cx="6205323" cy="5411752"/>
+                      <a:ext cx="3699227" cy="3226150"/>
                     </a:xfrm>
                     <a:prstGeom prst="rect">
                       <a:avLst/>
@@ -4112,11 +4301,10 @@
           <w:sz w:val="22"/>
           <w:szCs w:val="22"/>
         </w:rPr>
-        <w:lastRenderedPageBreak/>
         <w:drawing>
-          <wp:inline distT="0" distB="0" distL="0" distR="0" wp14:anchorId="1EDD1E75" wp14:editId="7ED633C9">
-            <wp:extent cx="4885233" cy="3974471"/>
-            <wp:effectExtent l="0" t="0" r="0" b="6985"/>
+          <wp:inline distT="0" distB="0" distL="0" distR="0" wp14:anchorId="1EDD1E75" wp14:editId="5B854E5D">
+            <wp:extent cx="3016250" cy="2453925"/>
+            <wp:effectExtent l="0" t="0" r="0" b="3810"/>
             <wp:docPr id="1078720845" name="Picture 1"/>
             <wp:cNvGraphicFramePr>
               <a:graphicFrameLocks xmlns:a="http://schemas.openxmlformats.org/drawingml/2006/main" noChangeAspect="1"/>
@@ -4137,7 +4325,7 @@
                   <pic:spPr>
                     <a:xfrm>
                       <a:off x="0" y="0"/>
-                      <a:ext cx="4893020" cy="3980806"/>
+                      <a:ext cx="3026972" cy="2462648"/>
                     </a:xfrm>
                     <a:prstGeom prst="rect">
                       <a:avLst/>
@@ -4180,6 +4368,7 @@
           <w:sz w:val="22"/>
           <w:szCs w:val="22"/>
         </w:rPr>
+        <w:lastRenderedPageBreak/>
         <w:t>Once you’re on the properties page click “Internet Protocol Version 4 (TCP/IPv4</w:t>
       </w:r>
       <w:r>
@@ -4215,11 +4404,10 @@
           <w:sz w:val="22"/>
           <w:szCs w:val="22"/>
         </w:rPr>
-        <w:lastRenderedPageBreak/>
         <w:drawing>
-          <wp:inline distT="0" distB="0" distL="0" distR="0" wp14:anchorId="789FFA37" wp14:editId="3F42075B">
-            <wp:extent cx="3010277" cy="4062587"/>
-            <wp:effectExtent l="0" t="0" r="0" b="0"/>
+          <wp:inline distT="0" distB="0" distL="0" distR="0" wp14:anchorId="789FFA37" wp14:editId="7C447011">
+            <wp:extent cx="2508250" cy="3385065"/>
+            <wp:effectExtent l="0" t="0" r="6350" b="6350"/>
             <wp:docPr id="1321694365" name="Picture 1"/>
             <wp:cNvGraphicFramePr>
               <a:graphicFrameLocks xmlns:a="http://schemas.openxmlformats.org/drawingml/2006/main" noChangeAspect="1"/>
@@ -4240,7 +4428,7 @@
                   <pic:spPr>
                     <a:xfrm>
                       <a:off x="0" y="0"/>
-                      <a:ext cx="3065639" cy="4137302"/>
+                      <a:ext cx="2556147" cy="3449706"/>
                     </a:xfrm>
                     <a:prstGeom prst="rect">
                       <a:avLst/>
@@ -4387,11 +4575,10 @@
           <w:sz w:val="22"/>
           <w:szCs w:val="22"/>
         </w:rPr>
-        <w:lastRenderedPageBreak/>
         <w:drawing>
-          <wp:inline distT="0" distB="0" distL="0" distR="0" wp14:anchorId="0087BACE" wp14:editId="503FBBBF">
-            <wp:extent cx="4834550" cy="3320655"/>
-            <wp:effectExtent l="0" t="0" r="4445" b="0"/>
+          <wp:inline distT="0" distB="0" distL="0" distR="0" wp14:anchorId="0087BACE" wp14:editId="0AE0B190">
+            <wp:extent cx="4114017" cy="2825750"/>
+            <wp:effectExtent l="0" t="0" r="1270" b="0"/>
             <wp:docPr id="365655639" name="Picture 1"/>
             <wp:cNvGraphicFramePr>
               <a:graphicFrameLocks xmlns:a="http://schemas.openxmlformats.org/drawingml/2006/main" noChangeAspect="1"/>
@@ -4412,7 +4599,7 @@
                   <pic:spPr>
                     <a:xfrm>
                       <a:off x="0" y="0"/>
-                      <a:ext cx="4867233" cy="3343104"/>
+                      <a:ext cx="4147588" cy="2848809"/>
                     </a:xfrm>
                     <a:prstGeom prst="rect">
                       <a:avLst/>
@@ -4455,6 +4642,7 @@
           <w:sz w:val="22"/>
           <w:szCs w:val="22"/>
         </w:rPr>
+        <w:lastRenderedPageBreak/>
         <w:t xml:space="preserve">Now head back over to your </w:t>
       </w:r>
       <w:r>
@@ -4666,7 +4854,6 @@
           <w:sz w:val="22"/>
           <w:szCs w:val="22"/>
         </w:rPr>
-        <w:lastRenderedPageBreak/>
         <w:t>The add roles and features wizard page should pop up. Click next until we get to the “Select server roles” page. Here is where we will need to select the “Active Directory Domain Services” and click “add features”.</w:t>
       </w:r>
     </w:p>
@@ -4821,6 +5008,7 @@
           <w:sz w:val="22"/>
           <w:szCs w:val="22"/>
         </w:rPr>
+        <w:lastRenderedPageBreak/>
         <w:t>With that done a deployment configuration screen will pop</w:t>
       </w:r>
       <w:r>
@@ -5052,11 +5240,10 @@
         <w:rPr>
           <w:noProof/>
         </w:rPr>
-        <w:lastRenderedPageBreak/>
         <w:drawing>
-          <wp:inline distT="0" distB="0" distL="0" distR="0" wp14:anchorId="6A992212" wp14:editId="2CE68510">
-            <wp:extent cx="4145666" cy="2978590"/>
-            <wp:effectExtent l="0" t="0" r="7620" b="0"/>
+          <wp:inline distT="0" distB="0" distL="0" distR="0" wp14:anchorId="6A992212" wp14:editId="2E261B0C">
+            <wp:extent cx="3685474" cy="2647950"/>
+            <wp:effectExtent l="0" t="0" r="0" b="0"/>
             <wp:docPr id="1514673527" name="Picture 1"/>
             <wp:cNvGraphicFramePr>
               <a:graphicFrameLocks xmlns:a="http://schemas.openxmlformats.org/drawingml/2006/main" noChangeAspect="1"/>
@@ -5077,7 +5264,7 @@
                   <pic:spPr>
                     <a:xfrm>
                       <a:off x="0" y="0"/>
-                      <a:ext cx="4146948" cy="2979511"/>
+                      <a:ext cx="3692688" cy="2653133"/>
                     </a:xfrm>
                     <a:prstGeom prst="rect">
                       <a:avLst/>
@@ -5305,7 +5492,6 @@
           <w:sz w:val="22"/>
           <w:szCs w:val="22"/>
         </w:rPr>
-        <w:lastRenderedPageBreak/>
         <w:t>Upon reboot you will be brought back to the “Server Manager” application. In the top right corner go to tools &gt; Active Directory Users and Computers.</w:t>
       </w:r>
     </w:p>
@@ -5485,6 +5671,7 @@
         <w:rPr>
           <w:noProof/>
         </w:rPr>
+        <w:lastRenderedPageBreak/>
         <w:drawing>
           <wp:inline distT="0" distB="0" distL="0" distR="0" wp14:anchorId="69E2DFBB" wp14:editId="44D75F23">
             <wp:extent cx="3152990" cy="2195465"/>
@@ -7756,6 +7943,95 @@
     </w:lvl>
   </w:abstractNum>
   <w:abstractNum w:abstractNumId="14" w15:restartNumberingAfterBreak="0">
+    <w:nsid w:val="61B1180C"/>
+    <w:multiLevelType w:val="hybridMultilevel"/>
+    <w:tmpl w:val="C498B70E"/>
+    <w:lvl w:ilvl="0" w:tplc="0409000F">
+      <w:start w:val="1"/>
+      <w:numFmt w:val="decimal"/>
+      <w:lvlText w:val="%1."/>
+      <w:lvlJc w:val="left"/>
+      <w:pPr>
+        <w:ind w:left="720" w:hanging="360"/>
+      </w:pPr>
+      <w:rPr>
+        <w:rFonts w:hint="default"/>
+      </w:rPr>
+    </w:lvl>
+    <w:lvl w:ilvl="1" w:tplc="04090019" w:tentative="1">
+      <w:start w:val="1"/>
+      <w:numFmt w:val="lowerLetter"/>
+      <w:lvlText w:val="%2."/>
+      <w:lvlJc w:val="left"/>
+      <w:pPr>
+        <w:ind w:left="1440" w:hanging="360"/>
+      </w:pPr>
+    </w:lvl>
+    <w:lvl w:ilvl="2" w:tplc="0409001B" w:tentative="1">
+      <w:start w:val="1"/>
+      <w:numFmt w:val="lowerRoman"/>
+      <w:lvlText w:val="%3."/>
+      <w:lvlJc w:val="right"/>
+      <w:pPr>
+        <w:ind w:left="2160" w:hanging="180"/>
+      </w:pPr>
+    </w:lvl>
+    <w:lvl w:ilvl="3" w:tplc="0409000F" w:tentative="1">
+      <w:start w:val="1"/>
+      <w:numFmt w:val="decimal"/>
+      <w:lvlText w:val="%4."/>
+      <w:lvlJc w:val="left"/>
+      <w:pPr>
+        <w:ind w:left="2880" w:hanging="360"/>
+      </w:pPr>
+    </w:lvl>
+    <w:lvl w:ilvl="4" w:tplc="04090019" w:tentative="1">
+      <w:start w:val="1"/>
+      <w:numFmt w:val="lowerLetter"/>
+      <w:lvlText w:val="%5."/>
+      <w:lvlJc w:val="left"/>
+      <w:pPr>
+        <w:ind w:left="3600" w:hanging="360"/>
+      </w:pPr>
+    </w:lvl>
+    <w:lvl w:ilvl="5" w:tplc="0409001B" w:tentative="1">
+      <w:start w:val="1"/>
+      <w:numFmt w:val="lowerRoman"/>
+      <w:lvlText w:val="%6."/>
+      <w:lvlJc w:val="right"/>
+      <w:pPr>
+        <w:ind w:left="4320" w:hanging="180"/>
+      </w:pPr>
+    </w:lvl>
+    <w:lvl w:ilvl="6" w:tplc="0409000F" w:tentative="1">
+      <w:start w:val="1"/>
+      <w:numFmt w:val="decimal"/>
+      <w:lvlText w:val="%7."/>
+      <w:lvlJc w:val="left"/>
+      <w:pPr>
+        <w:ind w:left="5040" w:hanging="360"/>
+      </w:pPr>
+    </w:lvl>
+    <w:lvl w:ilvl="7" w:tplc="04090019" w:tentative="1">
+      <w:start w:val="1"/>
+      <w:numFmt w:val="lowerLetter"/>
+      <w:lvlText w:val="%8."/>
+      <w:lvlJc w:val="left"/>
+      <w:pPr>
+        <w:ind w:left="5760" w:hanging="360"/>
+      </w:pPr>
+    </w:lvl>
+    <w:lvl w:ilvl="8" w:tplc="0409001B" w:tentative="1">
+      <w:start w:val="1"/>
+      <w:numFmt w:val="lowerRoman"/>
+      <w:lvlText w:val="%9."/>
+      <w:lvlJc w:val="right"/>
+      <w:pPr>
+        <w:ind w:left="6480" w:hanging="180"/>
+      </w:pPr>
+    </w:lvl>
+  </w:abstractNum>
+  <w:abstractNum w:abstractNumId="15" w15:restartNumberingAfterBreak="0">
     <w:nsid w:val="6B22452F"/>
     <w:multiLevelType w:val="hybridMultilevel"/>
     <w:tmpl w:val="BA6074BC"/>
@@ -7868,7 +8144,7 @@
       </w:rPr>
     </w:lvl>
   </w:abstractNum>
-  <w:abstractNum w:abstractNumId="15" w15:restartNumberingAfterBreak="0">
+  <w:abstractNum w:abstractNumId="16" w15:restartNumberingAfterBreak="0">
     <w:nsid w:val="788903D4"/>
     <w:multiLevelType w:val="hybridMultilevel"/>
     <w:tmpl w:val="C652CE8C"/>
@@ -7967,10 +8243,10 @@
     <w:abstractNumId w:val="12"/>
   </w:num>
   <w:num w:numId="4" w16cid:durableId="1664774100">
-    <w:abstractNumId w:val="14"/>
+    <w:abstractNumId w:val="15"/>
   </w:num>
   <w:num w:numId="5" w16cid:durableId="363336253">
-    <w:abstractNumId w:val="15"/>
+    <w:abstractNumId w:val="16"/>
   </w:num>
   <w:num w:numId="6" w16cid:durableId="2511554">
     <w:abstractNumId w:val="10"/>
@@ -8004,6 +8280,9 @@
   </w:num>
   <w:num w:numId="16" w16cid:durableId="1941185320">
     <w:abstractNumId w:val="13"/>
+  </w:num>
+  <w:num w:numId="17" w16cid:durableId="381288736">
+    <w:abstractNumId w:val="14"/>
   </w:num>
 </w:numbering>
 </file>

</xml_diff>